<commit_message>
Add EK PowerPoint draft, updated playbook files, Gantt chart fixes, and build script
- deliverables/SRAM_AI_Adoption_Playbook_vEK Updates.pptx: EK's working PowerPoint draft
- deliverables/SRAM_AI_Adoption_Playbook_MOST CURRENT USE THIS AND REMOVE OTHERS.docx/.pdf: latest EK playbook draft
- research/SRAM_Pilot_Gantt_Charts.html: corrected Day-90 draft acceptance and Day-120 go/no-go checkpoint timing
- tools/build_pilot_gantt_charts.py: script used to generate the Gantt chart HTML
</commit_message>
<xml_diff>
--- a/deliverables/SRAM_AI_Adoption_Playbook_MOST CURRENT USE THIS AND REMOVE OTHERS.docx
+++ b/deliverables/SRAM_AI_Adoption_Playbook_MOST CURRENT USE THIS AND REMOVE OTHERS.docx
@@ -5475,6 +5475,31 @@
     </w:p>
     <w:p>
       <w:pPr>
+        <w:pStyle w:val="BodyText"/>
+      </w:pPr>
+    </w:p>
+    <w:p>
+      <w:pPr>
+        <w:pStyle w:val="BodyText"/>
+      </w:pPr>
+    </w:p>
+    <w:p>
+      <w:pPr>
+        <w:pStyle w:val="BodyText"/>
+      </w:pPr>
+    </w:p>
+    <w:p>
+      <w:pPr>
+        <w:pStyle w:val="BodyText"/>
+      </w:pPr>
+    </w:p>
+    <w:p>
+      <w:pPr>
+        <w:pStyle w:val="BodyText"/>
+      </w:pPr>
+    </w:p>
+    <w:p>
+      <w:pPr>
         <w:pStyle w:val="BlockText"/>
         <w:ind w:left="0"/>
         <w:rPr>
@@ -5585,8 +5610,8 @@
       </w:tblPr>
       <w:tblGrid>
         <w:gridCol w:w="1661"/>
-        <w:gridCol w:w="3939"/>
-        <w:gridCol w:w="3976"/>
+        <w:gridCol w:w="3904"/>
+        <w:gridCol w:w="4011"/>
       </w:tblGrid>
       <w:tr>
         <w:trPr>
@@ -5705,7 +5730,6 @@
                 <w:sz w:val="20"/>
                 <w:szCs w:val="20"/>
               </w:rPr>
-              <w:lastRenderedPageBreak/>
               <w:t xml:space="preserve">Key Initiatives </w:t>
             </w:r>
           </w:p>
@@ -6437,7 +6461,16 @@
                 <w:sz w:val="20"/>
                 <w:szCs w:val="20"/>
               </w:rPr>
-              <w:t xml:space="preserve">By </w:t>
+              <w:t>During Pilot through Day 120 and</w:t>
+            </w:r>
+            <w:r>
+              <w:rPr>
+                <w:rFonts w:ascii="Times New Roman" w:hAnsi="Times New Roman" w:cs="Times New Roman"/>
+                <w:color w:val="000000" w:themeColor="text1"/>
+                <w:sz w:val="20"/>
+                <w:szCs w:val="20"/>
+              </w:rPr>
+              <w:t xml:space="preserve"> </w:t>
             </w:r>
             <w:r>
               <w:rPr>
@@ -6499,7 +6532,17 @@
                 <w:sz w:val="20"/>
                 <w:szCs w:val="20"/>
               </w:rPr>
-              <w:t>reduction in average time to first response on AXS and Hammerhead ticket pilots</w:t>
+              <w:t xml:space="preserve">reduction in average </w:t>
+            </w:r>
+            <w:r>
+              <w:rPr>
+                <w:rFonts w:ascii="Times New Roman" w:hAnsi="Times New Roman" w:cs="Times New Roman"/>
+                <w:color w:val="000000" w:themeColor="text1"/>
+                <w:sz w:val="20"/>
+                <w:szCs w:val="20"/>
+              </w:rPr>
+              <w:lastRenderedPageBreak/>
+              <w:t>time to first response on AXS and Hammerhead ticket pilots</w:t>
             </w:r>
           </w:p>
           <w:p>
@@ -6603,17 +6646,7 @@
                 <w:sz w:val="20"/>
                 <w:szCs w:val="20"/>
               </w:rPr>
-              <w:t xml:space="preserve">90% agreement between AI warranty agent </w:t>
-            </w:r>
-            <w:r>
-              <w:rPr>
-                <w:rFonts w:ascii="Times New Roman" w:hAnsi="Times New Roman" w:cs="Times New Roman"/>
-                <w:color w:val="000000" w:themeColor="text1"/>
-                <w:sz w:val="20"/>
-                <w:szCs w:val="20"/>
-              </w:rPr>
-              <w:lastRenderedPageBreak/>
-              <w:t>recommendation and human decision</w:t>
+              <w:t>90% agreement between AI warranty agent recommendation and human decision</w:t>
             </w:r>
           </w:p>
         </w:tc>
@@ -6671,6 +6704,7 @@
                 <w:sz w:val="20"/>
                 <w:szCs w:val="20"/>
               </w:rPr>
+              <w:lastRenderedPageBreak/>
               <w:t>By Month 36:</w:t>
             </w:r>
           </w:p>
@@ -6821,7 +6855,6 @@
                 <w:sz w:val="20"/>
                 <w:szCs w:val="20"/>
               </w:rPr>
-              <w:lastRenderedPageBreak/>
               <w:t>&gt;</w:t>
             </w:r>
             <w:r>
@@ -6831,7 +6864,25 @@
                 <w:sz w:val="20"/>
                 <w:szCs w:val="20"/>
               </w:rPr>
-              <w:t>$1.6M in annualized avoidable inventory loss recovered</w:t>
+              <w:t>$1.6</w:t>
+            </w:r>
+            <w:r>
+              <w:rPr>
+                <w:rFonts w:ascii="Times New Roman" w:hAnsi="Times New Roman" w:cs="Times New Roman"/>
+                <w:color w:val="000000" w:themeColor="text1"/>
+                <w:sz w:val="20"/>
+                <w:szCs w:val="20"/>
+              </w:rPr>
+              <w:t>mm</w:t>
+            </w:r>
+            <w:r>
+              <w:rPr>
+                <w:rFonts w:ascii="Times New Roman" w:hAnsi="Times New Roman" w:cs="Times New Roman"/>
+                <w:color w:val="000000" w:themeColor="text1"/>
+                <w:sz w:val="20"/>
+                <w:szCs w:val="20"/>
+              </w:rPr>
+              <w:t xml:space="preserve"> in annualized avoidable inventory loss recovered</w:t>
             </w:r>
           </w:p>
         </w:tc>
@@ -7389,7 +7440,43 @@
                 <w:sz w:val="20"/>
                 <w:szCs w:val="20"/>
               </w:rPr>
-              <w:t>Costs: ~$500K setup (SageMaker development, data science lead ramp, analyst retraining); ~$700K annually in ongoing operations (data science lead, SageMaker compute, data engineer time)</w:t>
+              <w:t>Costs: ~$500</w:t>
+            </w:r>
+            <w:r>
+              <w:rPr>
+                <w:rFonts w:ascii="Times New Roman" w:hAnsi="Times New Roman" w:cs="Times New Roman"/>
+                <w:color w:val="000000" w:themeColor="text1"/>
+                <w:sz w:val="20"/>
+                <w:szCs w:val="20"/>
+              </w:rPr>
+              <w:t>k</w:t>
+            </w:r>
+            <w:r>
+              <w:rPr>
+                <w:rFonts w:ascii="Times New Roman" w:hAnsi="Times New Roman" w:cs="Times New Roman"/>
+                <w:color w:val="000000" w:themeColor="text1"/>
+                <w:sz w:val="20"/>
+                <w:szCs w:val="20"/>
+              </w:rPr>
+              <w:t xml:space="preserve"> setup (SageMaker development, data science lead ramp, analyst retraining); ~$700</w:t>
+            </w:r>
+            <w:r>
+              <w:rPr>
+                <w:rFonts w:ascii="Times New Roman" w:hAnsi="Times New Roman" w:cs="Times New Roman"/>
+                <w:color w:val="000000" w:themeColor="text1"/>
+                <w:sz w:val="20"/>
+                <w:szCs w:val="20"/>
+              </w:rPr>
+              <w:t>k</w:t>
+            </w:r>
+            <w:r>
+              <w:rPr>
+                <w:rFonts w:ascii="Times New Roman" w:hAnsi="Times New Roman" w:cs="Times New Roman"/>
+                <w:color w:val="000000" w:themeColor="text1"/>
+                <w:sz w:val="20"/>
+                <w:szCs w:val="20"/>
+              </w:rPr>
+              <w:t xml:space="preserve"> annually in ongoing operations (data science lead, SageMaker compute, data engineer time)</w:t>
             </w:r>
           </w:p>
           <w:p>
@@ -7433,7 +7520,25 @@
                 <w:sz w:val="20"/>
                 <w:szCs w:val="20"/>
               </w:rPr>
-              <w:t xml:space="preserve">$2.5M stockout loss recovery, </w:t>
+              <w:t>$2.5</w:t>
+            </w:r>
+            <w:r>
+              <w:rPr>
+                <w:rFonts w:ascii="Times New Roman" w:hAnsi="Times New Roman" w:cs="Times New Roman"/>
+                <w:color w:val="000000" w:themeColor="text1"/>
+                <w:sz w:val="20"/>
+                <w:szCs w:val="20"/>
+              </w:rPr>
+              <w:t>mm</w:t>
+            </w:r>
+            <w:r>
+              <w:rPr>
+                <w:rFonts w:ascii="Times New Roman" w:hAnsi="Times New Roman" w:cs="Times New Roman"/>
+                <w:color w:val="000000" w:themeColor="text1"/>
+                <w:sz w:val="20"/>
+                <w:szCs w:val="20"/>
+              </w:rPr>
+              <w:t xml:space="preserve"> stockout loss recovery, </w:t>
             </w:r>
             <w:r>
               <w:rPr>
@@ -7451,7 +7556,25 @@
                 <w:sz w:val="20"/>
                 <w:szCs w:val="20"/>
               </w:rPr>
-              <w:t xml:space="preserve">$1.5M markdown reduction, </w:t>
+              <w:t>$1.5</w:t>
+            </w:r>
+            <w:r>
+              <w:rPr>
+                <w:rFonts w:ascii="Times New Roman" w:hAnsi="Times New Roman" w:cs="Times New Roman"/>
+                <w:color w:val="000000" w:themeColor="text1"/>
+                <w:sz w:val="20"/>
+                <w:szCs w:val="20"/>
+              </w:rPr>
+              <w:t>mm</w:t>
+            </w:r>
+            <w:r>
+              <w:rPr>
+                <w:rFonts w:ascii="Times New Roman" w:hAnsi="Times New Roman" w:cs="Times New Roman"/>
+                <w:color w:val="000000" w:themeColor="text1"/>
+                <w:sz w:val="20"/>
+                <w:szCs w:val="20"/>
+              </w:rPr>
+              <w:t xml:space="preserve"> markdown reduction, </w:t>
             </w:r>
             <w:r>
               <w:rPr>
@@ -7469,7 +7592,25 @@
                 <w:sz w:val="20"/>
                 <w:szCs w:val="20"/>
               </w:rPr>
-              <w:t>$0.8M inventory carrying cost savings, plus a one-time working capital release from inventory reduction</w:t>
+              <w:t>$0.8</w:t>
+            </w:r>
+            <w:r>
+              <w:rPr>
+                <w:rFonts w:ascii="Times New Roman" w:hAnsi="Times New Roman" w:cs="Times New Roman"/>
+                <w:color w:val="000000" w:themeColor="text1"/>
+                <w:sz w:val="20"/>
+                <w:szCs w:val="20"/>
+              </w:rPr>
+              <w:t>mm</w:t>
+            </w:r>
+            <w:r>
+              <w:rPr>
+                <w:rFonts w:ascii="Times New Roman" w:hAnsi="Times New Roman" w:cs="Times New Roman"/>
+                <w:color w:val="000000" w:themeColor="text1"/>
+                <w:sz w:val="20"/>
+                <w:szCs w:val="20"/>
+              </w:rPr>
+              <w:t xml:space="preserve"> inventory carrying cost savings, plus a one-time working capital release from inventory reduction</w:t>
             </w:r>
           </w:p>
         </w:tc>
@@ -7602,7 +7743,17 @@
           <w:sz w:val="20"/>
           <w:szCs w:val="20"/>
         </w:rPr>
-        <w:t xml:space="preserve"> for these initiatives on that basis; depending on where SRAM is on its AI journey initially 36 months in and where their business is positioned, these opportunities may be ranked differently depending on strategic importance and potential returns. As such, we view these </w:t>
+        <w:t xml:space="preserve"> for these initiatives on that basis; depending on where SRAM is on its AI journey initially 36 months in and where their business is positioned, these opportunities may be ranked differently depending on strategic importance and potential returns. As such, we </w:t>
+      </w:r>
+      <w:r>
+        <w:rPr>
+          <w:rFonts w:ascii="Times New Roman" w:hAnsi="Times New Roman" w:cs="Times New Roman"/>
+          <w:color w:val="000000" w:themeColor="text1"/>
+          <w:sz w:val="20"/>
+          <w:szCs w:val="20"/>
+        </w:rPr>
+        <w:lastRenderedPageBreak/>
+        <w:t xml:space="preserve">view these </w:t>
       </w:r>
       <w:r>
         <w:rPr>
@@ -7932,7 +8083,6 @@
                 <w:sz w:val="20"/>
                 <w:szCs w:val="20"/>
               </w:rPr>
-              <w:lastRenderedPageBreak/>
               <w:t>Month 36 - Month 54</w:t>
             </w:r>
           </w:p>
@@ -8005,17 +8155,7 @@
                 <w:sz w:val="20"/>
                 <w:szCs w:val="20"/>
               </w:rPr>
-              <w:t xml:space="preserve">2mm </w:t>
-            </w:r>
-            <w:r>
-              <w:rPr>
-                <w:rFonts w:ascii="Times New Roman" w:hAnsi="Times New Roman" w:cs="Times New Roman"/>
-                <w:color w:val="000000" w:themeColor="text1"/>
-                <w:sz w:val="20"/>
-                <w:szCs w:val="20"/>
-              </w:rPr>
-              <w:lastRenderedPageBreak/>
-              <w:t>annual</w:t>
+              <w:t>2mm annual</w:t>
             </w:r>
             <w:r>
               <w:rPr>
@@ -8148,7 +8288,6 @@
                 <w:sz w:val="20"/>
                 <w:szCs w:val="20"/>
               </w:rPr>
-              <w:lastRenderedPageBreak/>
               <w:t>Cross-Brand PM staffing</w:t>
             </w:r>
           </w:p>
@@ -8250,7 +8389,6 @@
                 <w:sz w:val="20"/>
                 <w:szCs w:val="20"/>
               </w:rPr>
-              <w:lastRenderedPageBreak/>
               <w:t>Generative design and R&amp;D acceleration</w:t>
             </w:r>
           </w:p>
@@ -9210,7 +9348,17 @@
                 <w:sz w:val="20"/>
                 <w:szCs w:val="20"/>
               </w:rPr>
-              <w:t>Compatible upgrade recommendations</w:t>
+              <w:t xml:space="preserve">Compatible </w:t>
+            </w:r>
+            <w:r>
+              <w:rPr>
+                <w:rFonts w:ascii="Times New Roman" w:hAnsi="Times New Roman" w:cs="Times New Roman"/>
+                <w:color w:val="000000" w:themeColor="text1"/>
+                <w:sz w:val="20"/>
+                <w:szCs w:val="20"/>
+              </w:rPr>
+              <w:lastRenderedPageBreak/>
+              <w:t>upgrade recommendations</w:t>
             </w:r>
           </w:p>
         </w:tc>
@@ -9237,7 +9385,18 @@
                 <w:sz w:val="20"/>
                 <w:szCs w:val="20"/>
               </w:rPr>
-              <w:t>Amazon SageMaker compatibility rules engine + recommendation model</w:t>
+              <w:lastRenderedPageBreak/>
+              <w:t xml:space="preserve">Amazon SageMaker compatibility rules </w:t>
+            </w:r>
+            <w:r>
+              <w:rPr>
+                <w:rFonts w:ascii="Times New Roman" w:hAnsi="Times New Roman" w:cs="Times New Roman"/>
+                <w:color w:val="000000" w:themeColor="text1"/>
+                <w:sz w:val="20"/>
+                <w:szCs w:val="20"/>
+              </w:rPr>
+              <w:lastRenderedPageBreak/>
+              <w:t>engine + recommendation model</w:t>
             </w:r>
           </w:p>
           <w:p>
@@ -9325,17 +9484,7 @@
                 <w:sz w:val="20"/>
                 <w:szCs w:val="20"/>
               </w:rPr>
-              <w:t xml:space="preserve">redictive maintenance alerts; </w:t>
-            </w:r>
-            <w:r>
-              <w:rPr>
-                <w:rFonts w:ascii="Times New Roman" w:hAnsi="Times New Roman" w:cs="Times New Roman"/>
-                <w:color w:val="000000" w:themeColor="text1"/>
-                <w:sz w:val="20"/>
-                <w:szCs w:val="20"/>
-              </w:rPr>
-              <w:lastRenderedPageBreak/>
-              <w:t>dealer inventory optimization</w:t>
+              <w:t>redictive maintenance alerts; dealer inventory optimization</w:t>
             </w:r>
           </w:p>
         </w:tc>
@@ -9533,6 +9682,7 @@
                 <w:sz w:val="20"/>
                 <w:szCs w:val="20"/>
               </w:rPr>
+              <w:lastRenderedPageBreak/>
               <w:t>Sales and marketing leadership</w:t>
             </w:r>
           </w:p>
@@ -9674,17 +9824,7 @@
                 <w:sz w:val="20"/>
                 <w:szCs w:val="20"/>
               </w:rPr>
-              <w:t xml:space="preserve">AI model training on purchase history and </w:t>
-            </w:r>
-            <w:r>
-              <w:rPr>
-                <w:rFonts w:ascii="Times New Roman" w:hAnsi="Times New Roman" w:cs="Times New Roman"/>
-                <w:color w:val="000000" w:themeColor="text1"/>
-                <w:sz w:val="20"/>
-                <w:szCs w:val="20"/>
-              </w:rPr>
-              <w:lastRenderedPageBreak/>
-              <w:t>AXS usage data</w:t>
+              <w:t>AI model training on purchase history and AXS usage data</w:t>
             </w:r>
           </w:p>
         </w:tc>
@@ -9800,6 +9940,7 @@
     <w:p>
       <w:pPr>
         <w:pStyle w:val="BodyText"/>
+        <w:jc w:val="center"/>
         <w:rPr>
           <w:color w:val="000000" w:themeColor="text1"/>
         </w:rPr>
@@ -9808,6 +9949,7 @@
     <w:p>
       <w:pPr>
         <w:pStyle w:val="BodyText"/>
+        <w:jc w:val="center"/>
         <w:rPr>
           <w:color w:val="000000" w:themeColor="text1"/>
         </w:rPr>
@@ -9818,6 +9960,67 @@
         <w:pStyle w:val="BodyText"/>
         <w:jc w:val="center"/>
         <w:rPr>
+          <w:color w:val="000000" w:themeColor="text1"/>
+        </w:rPr>
+      </w:pPr>
+    </w:p>
+    <w:p>
+      <w:pPr>
+        <w:pStyle w:val="BodyText"/>
+        <w:jc w:val="center"/>
+        <w:rPr>
+          <w:color w:val="000000" w:themeColor="text1"/>
+        </w:rPr>
+      </w:pPr>
+    </w:p>
+    <w:p>
+      <w:pPr>
+        <w:pStyle w:val="BodyText"/>
+        <w:jc w:val="center"/>
+        <w:rPr>
+          <w:color w:val="000000" w:themeColor="text1"/>
+        </w:rPr>
+      </w:pPr>
+    </w:p>
+    <w:p>
+      <w:pPr>
+        <w:pStyle w:val="BodyText"/>
+        <w:jc w:val="center"/>
+        <w:rPr>
+          <w:color w:val="000000" w:themeColor="text1"/>
+        </w:rPr>
+      </w:pPr>
+    </w:p>
+    <w:p>
+      <w:pPr>
+        <w:pStyle w:val="BodyText"/>
+        <w:jc w:val="center"/>
+        <w:rPr>
+          <w:color w:val="000000" w:themeColor="text1"/>
+        </w:rPr>
+      </w:pPr>
+    </w:p>
+    <w:p>
+      <w:pPr>
+        <w:pStyle w:val="BodyText"/>
+        <w:rPr>
+          <w:color w:val="000000" w:themeColor="text1"/>
+        </w:rPr>
+      </w:pPr>
+    </w:p>
+    <w:p>
+      <w:pPr>
+        <w:pStyle w:val="BodyText"/>
+        <w:rPr>
+          <w:color w:val="000000" w:themeColor="text1"/>
+        </w:rPr>
+      </w:pPr>
+    </w:p>
+    <w:p>
+      <w:pPr>
+        <w:pStyle w:val="BodyText"/>
+        <w:jc w:val="center"/>
+        <w:rPr>
           <w:rFonts w:ascii="Times New Roman" w:hAnsi="Times New Roman" w:cs="Times New Roman"/>
           <w:b/>
           <w:bCs/>
@@ -9837,6 +10040,7 @@
           <w:szCs w:val="20"/>
           <w:u w:val="single"/>
         </w:rPr>
+        <w:lastRenderedPageBreak/>
         <w:t>Appendix I</w:t>
       </w:r>
     </w:p>
@@ -10663,21 +10867,20 @@
         <w:t>Appendix II</w:t>
       </w:r>
     </w:p>
+    <w:bookmarkEnd w:id="0"/>
+    <w:bookmarkEnd w:id="14"/>
+    <w:bookmarkEnd w:id="15"/>
     <w:p>
       <w:pPr>
         <w:pStyle w:val="BodyText"/>
         <w:jc w:val="center"/>
       </w:pPr>
       <w:r>
-        <w:rPr>
-          <w:noProof/>
-        </w:rPr>
-        <w:lastRenderedPageBreak/>
         <w:drawing>
-          <wp:inline distT="0" distB="0" distL="0" distR="0" wp14:anchorId="597A367A" wp14:editId="759ACB1E">
-            <wp:extent cx="5667375" cy="7542377"/>
+          <wp:inline distT="0" distB="0" distL="0" distR="0" wp14:anchorId="43D95C14" wp14:editId="5CA80E7F">
+            <wp:extent cx="5622422" cy="7487285"/>
             <wp:effectExtent l="0" t="0" r="0" b="0"/>
-            <wp:docPr id="380529489" name="Picture 2"/>
+            <wp:docPr id="715990464" name="Picture 1"/>
             <wp:cNvGraphicFramePr>
               <a:graphicFrameLocks xmlns:a="http://schemas.openxmlformats.org/drawingml/2006/main" noChangeAspect="1"/>
             </wp:cNvGraphicFramePr>
@@ -10685,41 +10888,23 @@
               <a:graphicData uri="http://schemas.openxmlformats.org/drawingml/2006/picture">
                 <pic:pic xmlns:pic="http://schemas.openxmlformats.org/drawingml/2006/picture">
                   <pic:nvPicPr>
-                    <pic:cNvPr id="0" name="Picture 293"/>
-                    <pic:cNvPicPr>
-                      <a:picLocks noChangeAspect="1" noChangeArrowheads="1"/>
-                    </pic:cNvPicPr>
+                    <pic:cNvPr id="715990464" name=""/>
+                    <pic:cNvPicPr/>
                   </pic:nvPicPr>
-                  <pic:blipFill rotWithShape="1">
-                    <a:blip r:embed="rId6">
-                      <a:extLst>
-                        <a:ext uri="{28A0092B-C50C-407E-A947-70E740481C1C}">
-                          <a14:useLocalDpi xmlns:a14="http://schemas.microsoft.com/office/drawing/2010/main" val="0"/>
-                        </a:ext>
-                      </a:extLst>
-                    </a:blip>
-                    <a:srcRect l="1592" t="1389" r="3807" b="16203"/>
+                  <pic:blipFill>
+                    <a:blip r:embed="rId6"/>
                     <a:stretch>
                       <a:fillRect/>
                     </a:stretch>
                   </pic:blipFill>
-                  <pic:spPr bwMode="auto">
+                  <pic:spPr>
                     <a:xfrm>
                       <a:off x="0" y="0"/>
-                      <a:ext cx="5667375" cy="7542377"/>
+                      <a:ext cx="5626808" cy="7493126"/>
                     </a:xfrm>
                     <a:prstGeom prst="rect">
                       <a:avLst/>
                     </a:prstGeom>
-                    <a:noFill/>
-                    <a:ln>
-                      <a:noFill/>
-                    </a:ln>
-                    <a:extLst>
-                      <a:ext uri="{53640926-AAD7-44D8-BBD7-CCE9431645EC}">
-                        <a14:shadowObscured xmlns:a14="http://schemas.microsoft.com/office/drawing/2010/main"/>
-                      </a:ext>
-                    </a:extLst>
                   </pic:spPr>
                 </pic:pic>
               </a:graphicData>
@@ -10727,9 +10912,6 @@
           </wp:inline>
         </w:drawing>
       </w:r>
-      <w:bookmarkEnd w:id="0"/>
-      <w:bookmarkEnd w:id="14"/>
-      <w:bookmarkEnd w:id="15"/>
     </w:p>
     <w:sectPr>
       <w:footnotePr>

</xml_diff>